<commit_message>
Polish portfolio and professional profile
</commit_message>
<xml_diff>
--- a/public/Namri_Amine_Resume.docx
+++ b/public/Namri_Amine_Resume.docx
@@ -4,7 +4,7 @@
   <w:body>
     <w:p>
       <w:pPr>
-        <w:spacing w:line="360" w:lineRule="auto"/>
+        <w:spacing w:line="240" w:lineRule="auto" w:before="0" w:after="30"/>
         <w:jc w:val="center"/>
         <w:rPr>
           <w:rFonts w:ascii="Arial" w:hAnsi="Arial" w:cs="Arial"/>
@@ -14,10 +14,10 @@
       </w:pPr>
       <w:r>
         <w:rPr>
-          <w:rFonts w:ascii="Arial" w:hAnsi="Arial" w:cs="Arial"/>
+          <w:rFonts w:ascii="Arial" w:hAnsi="Arial" w:cs="Arial" w:eastAsia="Arial"/>
           <w:b/>
-          <w:color w:val="003366"/>
-          <w:sz w:val="32"/>
+          <w:color w:val="0F172A"/>
+          <w:sz w:val="33"/>
           <w:szCs w:val="32"/>
         </w:rPr>
         <w:t>NAMRI AMINE</w:t>
@@ -25,7 +25,7 @@
     </w:p>
     <w:p>
       <w:pPr>
-        <w:spacing w:before="40" w:after="40" w:line="360" w:lineRule="auto"/>
+        <w:spacing w:before="0" w:after="28" w:line="240" w:lineRule="auto"/>
         <w:jc w:val="center"/>
         <w:rPr>
           <w:rFonts w:ascii="Arial" w:hAnsi="Arial" w:cs="Arial"/>
@@ -35,48 +35,17 @@
       </w:pPr>
       <w:r>
         <w:rPr>
-          <w:rFonts w:ascii="Arial" w:hAnsi="Arial" w:cs="Arial"/>
-          <w:b/>
-          <w:color w:val="003366"/>
+          <w:rFonts w:ascii="Arial" w:hAnsi="Arial" w:eastAsia="Arial"/>
+          <w:b w:val="0"/>
+          <w:color w:val="334155"/>
+          <w:sz w:val="16"/>
         </w:rPr>
-        <w:t xml:space="preserve">Senior Full-Stack </w:t>
-      </w:r>
-      <w:r>
-        <w:rPr>
-          <w:rFonts w:ascii="Arial" w:hAnsi="Arial" w:cs="Arial"/>
-          <w:b/>
-          <w:color w:val="003366"/>
-        </w:rPr>
-        <w:t>Developer | React</w:t>
-      </w:r>
-      <w:r>
-        <w:rPr>
-          <w:rFonts w:ascii="Arial" w:hAnsi="Arial" w:cs="Arial"/>
-          <w:b/>
-          <w:color w:val="003366"/>
-        </w:rPr>
-        <w:t xml:space="preserve"> • Next.js • TypeScript • </w:t>
-      </w:r>
-      <w:r>
-        <w:rPr>
-          <w:rFonts w:ascii="Arial" w:hAnsi="Arial" w:cs="Arial"/>
-          <w:b/>
-          <w:color w:val="003366"/>
-        </w:rPr>
-        <w:t>Node.js | GenAI</w:t>
-      </w:r>
-      <w:r>
-        <w:rPr>
-          <w:rFonts w:ascii="Arial" w:hAnsi="Arial" w:cs="Arial"/>
-          <w:b/>
-          <w:color w:val="003366"/>
-        </w:rPr>
-        <w:t xml:space="preserve"> &amp; LLM Integration</w:t>
+        <w:t>Senior JavaScript Full-Stack Developer | React | Next.js | TypeScript | Node.js/FastAPI | SaaS, APIs &amp; AI Systems</w:t>
       </w:r>
     </w:p>
     <w:p>
       <w:pPr>
-        <w:spacing w:line="360" w:lineRule="auto"/>
+        <w:spacing w:line="240" w:lineRule="auto" w:before="0" w:after="28"/>
         <w:jc w:val="center"/>
         <w:rPr>
           <w:rFonts w:ascii="Arial" w:hAnsi="Arial" w:cs="Arial"/>
@@ -86,17 +55,27 @@
       </w:pPr>
       <w:r>
         <w:rPr>
-          <w:rFonts w:ascii="Arial" w:hAnsi="Arial"/>
-          <w:sz w:val="20"/>
+          <w:rFonts w:ascii="Arial" w:hAnsi="Arial" w:eastAsia="Arial"/>
+          <w:b w:val="0"/>
+          <w:color w:val="334155"/>
+          <w:sz w:val="15"/>
         </w:rPr>
+        <w:t>Casablanca, Morocco | Open to Global Remote Full-Time &amp; Contract | Morocco / France-EU time zones</w:t>
+      </w:r>
+      <w:r>
+        <w:rPr>
+          <w:rFonts w:ascii="Arial" w:hAnsi="Arial" w:eastAsia="Arial"/>
+          <w:b w:val="0"/>
+          <w:color w:val="334155"/>
+          <w:sz w:val="15"/>
+        </w:rPr>
+        <w:br/>
         <w:t xml:space="preserve">+212-638-918700 | </w:t>
       </w:r>
       <w:hyperlink r:id="rId6">
         <w:r>
           <w:rPr>
-            <w:rFonts w:ascii="Arial" w:hAnsi="Arial"/>
             <w:color w:val="0563C1"/>
-            <w:sz w:val="20"/>
             <w:u w:val="single"/>
           </w:rPr>
           <w:t>aminenamri21@gmail.com</w:t>
@@ -104,51 +83,96 @@
       </w:hyperlink>
       <w:r>
         <w:rPr>
-          <w:rFonts w:ascii="Arial" w:hAnsi="Arial"/>
-          <w:sz w:val="20"/>
+          <w:rFonts w:ascii="Arial" w:hAnsi="Arial" w:eastAsia="Arial"/>
+          <w:b w:val="0"/>
+          <w:color w:val="334155"/>
+          <w:sz w:val="15"/>
         </w:rPr>
-        <w:t xml:space="preserve"> | </w:t>
+        <w:br/>
       </w:r>
       <w:hyperlink r:id="rId7">
         <w:r>
           <w:rPr>
-            <w:rFonts w:ascii="Arial" w:hAnsi="Arial"/>
             <w:color w:val="0563C1"/>
-            <w:sz w:val="20"/>
+            <w:u w:val="single"/>
+          </w:rPr>
+          <w:t>namr</w:t>
+        </w:r>
+        <w:r>
+          <w:rPr>
+            <w:color w:val="0563C1"/>
+            <w:u w:val="single"/>
+          </w:rPr>
+          <w:t>i</w:t>
+        </w:r>
+        <w:r>
+          <w:rPr>
+            <w:color w:val="0563C1"/>
+            <w:u w:val="single"/>
+          </w:rPr>
+          <w:t>-amine.vercel.app</w:t>
+        </w:r>
+      </w:hyperlink>
+      <w:r>
+        <w:rPr>
+          <w:rFonts w:ascii="Arial" w:hAnsi="Arial" w:eastAsia="Arial"/>
+          <w:b w:val="0"/>
+          <w:color w:val="334155"/>
+          <w:sz w:val="15"/>
+        </w:rPr>
+        <w:t xml:space="preserve"> | </w:t>
+      </w:r>
+      <w:hyperlink r:id="rId8">
+        <w:r>
+          <w:rPr>
+            <w:color w:val="0563C1"/>
+            <w:u w:val="single"/>
+          </w:rPr>
+          <w:t>github.com/NAMRIAMINE</w:t>
+        </w:r>
+      </w:hyperlink>
+      <w:r>
+        <w:rPr>
+          <w:rFonts w:ascii="Arial" w:hAnsi="Arial" w:eastAsia="Arial"/>
+          <w:b w:val="0"/>
+          <w:color w:val="334155"/>
+          <w:sz w:val="15"/>
+        </w:rPr>
+        <w:t xml:space="preserve"> | </w:t>
+      </w:r>
+      <w:hyperlink r:id="rId9">
+        <w:r>
+          <w:rPr>
+            <w:color w:val="0563C1"/>
             <w:u w:val="single"/>
           </w:rPr>
           <w:t>linkedin.com/in/namriamine</w:t>
         </w:r>
       </w:hyperlink>
-      <w:r>
-        <w:rPr>
-          <w:rFonts w:ascii="Arial" w:hAnsi="Arial"/>
-          <w:sz w:val="20"/>
-        </w:rPr>
-        <w:t xml:space="preserve"> | Casablanca, Morocco</w:t>
-      </w:r>
     </w:p>
     <w:p>
       <w:pPr>
         <w:pStyle w:val="Heading1"/>
-        <w:spacing w:line="360" w:lineRule="auto"/>
-        <w:jc w:val="both"/>
+        <w:keepNext/>
+        <w:spacing w:line="240" w:lineRule="auto" w:before="84" w:after="32"/>
+        <w:jc w:val="left"/>
         <w:rPr>
           <w:rFonts w:ascii="Arial" w:hAnsi="Arial" w:cs="Arial"/>
         </w:rPr>
       </w:pPr>
       <w:r>
         <w:rPr>
-          <w:rFonts w:ascii="Arial" w:hAnsi="Arial" w:cs="Arial"/>
-          <w:color w:val="003366"/>
-          <w:sz w:val="24"/>
+          <w:rFonts w:ascii="Arial" w:hAnsi="Arial" w:cs="Arial" w:eastAsia="Arial"/>
+          <w:b/>
+          <w:color w:val="0D9488"/>
+          <w:sz w:val="18"/>
         </w:rPr>
         <w:t>PROFESSIONAL SUMMARY</w:t>
       </w:r>
     </w:p>
     <w:p>
       <w:pPr>
-        <w:spacing w:after="120" w:line="360" w:lineRule="auto"/>
+        <w:spacing w:after="16" w:line="240" w:lineRule="auto" w:before="0"/>
         <w:jc w:val="both"/>
         <w:rPr>
           <w:rFonts w:ascii="Arial" w:hAnsi="Arial" w:cs="Arial"/>
@@ -158,33 +182,37 @@
       </w:pPr>
       <w:r>
         <w:rPr>
-          <w:rFonts w:ascii="Arial" w:hAnsi="Arial" w:cs="Arial"/>
-          <w:sz w:val="20"/>
-          <w:szCs w:val="20"/>
+          <w:rFonts w:ascii="Arial" w:hAnsi="Arial" w:eastAsia="Arial"/>
+          <w:b w:val="0"/>
+          <w:color w:val="1E293B"/>
+          <w:sz w:val="16"/>
         </w:rPr>
-        <w:t>Senior Full-Stack Developer with 6+ years building production web applications and AI-enabled platforms across creative automation, industrial drone inspection, and geospatial SaaS. Proven track record delivering end-to-end features from React architecture and accessible UI systems to REST APIs, job queues, database migrations, and AI/CV pipelines. Experienced with Google Gemini, YOLO-assisted inspection workflows, CDN delivery, and background processing in agile remote teams.</w:t>
+        <w:t>Senior JavaScript/TypeScript Full-Stack Developer with 6+ years building SaaS products, APIs, data workflows, and responsive web applications. Strong experience with React, Next.js, TypeScript, Node.js, FastAPI, PostgreSQL/MySQL, authentication, background queues, database migrations, testing, CI/CD, and deployment, with recent work across AI-enabled creative automation, industrial drone inspection, and geospatial workflows. Comfortable owning features end to end: frontend architecture, API design, backend services, database design, background jobs, integrations, performance, accessibility, and production delivery.</w:t>
       </w:r>
     </w:p>
     <w:p>
       <w:pPr>
         <w:pStyle w:val="Heading1"/>
-        <w:spacing w:line="360" w:lineRule="auto"/>
+        <w:keepNext/>
+        <w:spacing w:line="240" w:lineRule="auto" w:before="84" w:after="32"/>
+        <w:jc w:val="left"/>
         <w:rPr>
           <w:rFonts w:ascii="Arial" w:hAnsi="Arial" w:cs="Arial"/>
         </w:rPr>
       </w:pPr>
       <w:r>
         <w:rPr>
-          <w:rFonts w:ascii="Arial" w:hAnsi="Arial" w:cs="Arial"/>
-          <w:color w:val="003366"/>
-          <w:sz w:val="24"/>
+          <w:rFonts w:ascii="Arial" w:hAnsi="Arial" w:cs="Arial" w:eastAsia="Arial"/>
+          <w:b/>
+          <w:color w:val="0D9488"/>
+          <w:sz w:val="18"/>
         </w:rPr>
         <w:t>TECHNICAL SKILLS</w:t>
       </w:r>
     </w:p>
     <w:p>
       <w:pPr>
-        <w:spacing w:after="60" w:line="360" w:lineRule="auto"/>
+        <w:spacing w:after="11" w:line="240" w:lineRule="auto" w:before="0"/>
         <w:jc w:val="both"/>
         <w:rPr>
           <w:rFonts w:ascii="Arial" w:hAnsi="Arial" w:cs="Arial"/>
@@ -194,23 +222,27 @@
       </w:pPr>
       <w:r>
         <w:rPr>
-          <w:rFonts w:ascii="Arial" w:hAnsi="Arial"/>
-          <w:b/>
-          <w:sz w:val="18"/>
+          <w:rFonts w:ascii="Arial" w:hAnsi="Arial" w:cs="Arial" w:eastAsia="Arial"/>
+          <w:b w:val="0"/>
+          <w:color w:val="334155"/>
+          <w:sz w:val="16"/>
+          <w:szCs w:val="20"/>
         </w:rPr>
-        <w:t xml:space="preserve">Frontend/Mobile: </w:t>
+        <w:t>Frontend/Mobile</w:t>
       </w:r>
       <w:r>
         <w:rPr>
-          <w:rFonts w:ascii="Arial" w:hAnsi="Arial"/>
-          <w:sz w:val="18"/>
+          <w:rFonts w:ascii="Arial" w:hAnsi="Arial" w:eastAsia="Arial"/>
+          <w:b w:val="0"/>
+          <w:color w:val="334155"/>
+          <w:sz w:val="16"/>
         </w:rPr>
-        <w:t>React.js 18/19 (5+ yrs), Next.js 13-16, TypeScript 5, Tailwind CSS, React Native, Expo, Electron</w:t>
+        <w:t>: JavaScript ES6+, TypeScript, React.js, Next.js, Tailwind CSS, React Native, Expo, Electron</w:t>
       </w:r>
     </w:p>
     <w:p>
       <w:pPr>
-        <w:spacing w:after="60" w:line="360" w:lineRule="auto"/>
+        <w:spacing w:after="11" w:line="240" w:lineRule="auto" w:before="0"/>
         <w:jc w:val="both"/>
         <w:rPr>
           <w:rFonts w:ascii="Arial" w:hAnsi="Arial" w:cs="Arial"/>
@@ -220,17 +252,20 @@
       </w:pPr>
       <w:r>
         <w:rPr>
-          <w:rFonts w:ascii="Arial" w:hAnsi="Arial" w:cs="Arial"/>
-          <w:b/>
-          <w:sz w:val="20"/>
+          <w:rFonts w:ascii="Arial" w:hAnsi="Arial" w:cs="Arial" w:eastAsia="Arial"/>
+          <w:b w:val="0"/>
+          <w:color w:val="334155"/>
+          <w:sz w:val="16"/>
           <w:szCs w:val="20"/>
         </w:rPr>
         <w:t xml:space="preserve">State &amp; Data: </w:t>
       </w:r>
       <w:r>
         <w:rPr>
-          <w:rFonts w:ascii="Arial" w:hAnsi="Arial" w:cs="Arial"/>
-          <w:sz w:val="20"/>
+          <w:rFonts w:ascii="Arial" w:hAnsi="Arial" w:cs="Arial" w:eastAsia="Arial"/>
+          <w:b w:val="0"/>
+          <w:color w:val="334155"/>
+          <w:sz w:val="16"/>
           <w:szCs w:val="20"/>
         </w:rPr>
         <w:t>TanStack Query v5, Redux Toolkit, Zustand, React Hook Form, Context API</w:t>
@@ -238,7 +273,7 @@
     </w:p>
     <w:p>
       <w:pPr>
-        <w:spacing w:after="60" w:line="360" w:lineRule="auto"/>
+        <w:spacing w:after="11" w:line="240" w:lineRule="auto" w:before="0"/>
         <w:jc w:val="both"/>
         <w:rPr>
           <w:rFonts w:ascii="Arial" w:hAnsi="Arial" w:cs="Arial"/>
@@ -248,17 +283,20 @@
       </w:pPr>
       <w:r>
         <w:rPr>
-          <w:rFonts w:ascii="Arial" w:hAnsi="Arial" w:cs="Arial"/>
-          <w:b/>
-          <w:sz w:val="20"/>
+          <w:rFonts w:ascii="Arial" w:hAnsi="Arial" w:cs="Arial" w:eastAsia="Arial"/>
+          <w:b w:val="0"/>
+          <w:color w:val="334155"/>
+          <w:sz w:val="16"/>
           <w:szCs w:val="20"/>
         </w:rPr>
         <w:t xml:space="preserve">AI / CV / GenAI: </w:t>
       </w:r>
       <w:r>
         <w:rPr>
-          <w:rFonts w:ascii="Arial" w:hAnsi="Arial" w:cs="Arial"/>
-          <w:sz w:val="20"/>
+          <w:rFonts w:ascii="Arial" w:hAnsi="Arial" w:cs="Arial" w:eastAsia="Arial"/>
+          <w:b w:val="0"/>
+          <w:color w:val="334155"/>
+          <w:sz w:val="16"/>
           <w:szCs w:val="20"/>
         </w:rPr>
         <w:t>Google Gemini SDK, LLM API Integration, AI Pipelines, YOLOv8, ONNX Runtime, OpenCV</w:t>
@@ -266,7 +304,7 @@
     </w:p>
     <w:p>
       <w:pPr>
-        <w:spacing w:after="60" w:line="360" w:lineRule="auto"/>
+        <w:spacing w:after="11" w:line="240" w:lineRule="auto" w:before="0"/>
         <w:jc w:val="both"/>
         <w:rPr>
           <w:rFonts w:ascii="Arial" w:hAnsi="Arial" w:cs="Arial"/>
@@ -276,25 +314,27 @@
       </w:pPr>
       <w:r>
         <w:rPr>
-          <w:rFonts w:ascii="Arial" w:hAnsi="Arial" w:cs="Arial"/>
-          <w:b/>
-          <w:sz w:val="20"/>
+          <w:rFonts w:ascii="Arial" w:hAnsi="Arial" w:cs="Arial" w:eastAsia="Arial"/>
+          <w:b w:val="0"/>
+          <w:color w:val="334155"/>
+          <w:sz w:val="16"/>
           <w:szCs w:val="20"/>
         </w:rPr>
-        <w:t xml:space="preserve">Backend: </w:t>
+        <w:t>Backend</w:t>
       </w:r>
       <w:r>
         <w:rPr>
-          <w:rFonts w:ascii="Arial" w:hAnsi="Arial" w:cs="Arial"/>
-          <w:sz w:val="20"/>
-          <w:szCs w:val="20"/>
+          <w:rFonts w:ascii="Arial" w:hAnsi="Arial" w:eastAsia="Arial"/>
+          <w:b w:val="0"/>
+          <w:color w:val="334155"/>
+          <w:sz w:val="16"/>
         </w:rPr>
-        <w:t>Node.js, Express 5, FastAPI, BullMQ Pro, Celery, REST APIs, GraphQL, Socket.IO</w:t>
+        <w:t>: Node.js, Express, FastAPI, REST APIs, Socket.IO, BullMQ Pro, Celery</w:t>
       </w:r>
     </w:p>
     <w:p>
       <w:pPr>
-        <w:spacing w:after="60" w:line="360" w:lineRule="auto"/>
+        <w:spacing w:after="11" w:line="240" w:lineRule="auto" w:before="0"/>
         <w:jc w:val="both"/>
         <w:rPr>
           <w:rFonts w:ascii="Arial" w:hAnsi="Arial" w:cs="Arial"/>
@@ -304,26 +344,27 @@
       </w:pPr>
       <w:r>
         <w:rPr>
-          <w:rFonts w:ascii="Arial" w:hAnsi="Arial" w:cs="Arial"/>
-          <w:b/>
-          <w:bCs/>
-          <w:sz w:val="20"/>
+          <w:rFonts w:ascii="Arial" w:hAnsi="Arial" w:cs="Arial" w:eastAsia="Arial"/>
+          <w:b w:val="0"/>
+          <w:color w:val="334155"/>
+          <w:sz w:val="16"/>
           <w:szCs w:val="20"/>
         </w:rPr>
-        <w:t xml:space="preserve">Databases &amp; Auth: </w:t>
+        <w:t>Databases &amp; Auth</w:t>
       </w:r>
       <w:r>
         <w:rPr>
-          <w:rFonts w:ascii="Arial" w:hAnsi="Arial" w:cs="Arial"/>
-          <w:sz w:val="20"/>
-          <w:szCs w:val="20"/>
+          <w:rFonts w:ascii="Arial" w:hAnsi="Arial" w:eastAsia="Arial"/>
+          <w:b w:val="0"/>
+          <w:color w:val="334155"/>
+          <w:sz w:val="16"/>
         </w:rPr>
-        <w:t>PostgreSQL, MySQL, MongoDB, Supabase, Firebase, Prisma ORM, Better Auth, JWT/OAuth</w:t>
+        <w:t>: PostgreSQL, MySQL, MongoDB, Prisma ORM, Supabase, Firebase, Better Auth, JWT/OAuth</w:t>
       </w:r>
     </w:p>
     <w:p>
       <w:pPr>
-        <w:spacing w:after="60" w:line="360" w:lineRule="auto"/>
+        <w:spacing w:after="11" w:line="240" w:lineRule="auto" w:before="0"/>
         <w:jc w:val="both"/>
         <w:rPr>
           <w:rFonts w:ascii="Arial" w:hAnsi="Arial" w:cs="Arial"/>
@@ -333,26 +374,27 @@
       </w:pPr>
       <w:r>
         <w:rPr>
-          <w:rFonts w:ascii="Arial" w:hAnsi="Arial" w:cs="Arial"/>
-          <w:b/>
-          <w:bCs/>
-          <w:sz w:val="20"/>
+          <w:rFonts w:ascii="Arial" w:hAnsi="Arial" w:cs="Arial" w:eastAsia="Arial"/>
+          <w:b w:val="0"/>
+          <w:color w:val="334155"/>
+          <w:sz w:val="16"/>
           <w:szCs w:val="20"/>
         </w:rPr>
-        <w:t xml:space="preserve">Storage/CDN/Queues: </w:t>
+        <w:t>Storage/CDN/Queues</w:t>
       </w:r>
       <w:r>
         <w:rPr>
-          <w:rFonts w:ascii="Arial" w:hAnsi="Arial" w:cs="Arial"/>
-          <w:sz w:val="20"/>
-          <w:szCs w:val="20"/>
+          <w:rFonts w:ascii="Arial" w:hAnsi="Arial" w:eastAsia="Arial"/>
+          <w:b w:val="0"/>
+          <w:color w:val="334155"/>
+          <w:sz w:val="16"/>
         </w:rPr>
-        <w:t>Bunny CDN, Supabase Storage, Sharp, resvg-js, Multer, Redis, BullMQ Pro</w:t>
+        <w:t>: Redis, Bunny CDN, Supabase Storage, Sharp, resvg-js, Multer</w:t>
       </w:r>
     </w:p>
     <w:p>
       <w:pPr>
-        <w:spacing w:after="60" w:line="360" w:lineRule="auto"/>
+        <w:spacing w:after="11" w:line="240" w:lineRule="auto" w:before="0"/>
         <w:jc w:val="both"/>
         <w:rPr>
           <w:rFonts w:ascii="Arial" w:hAnsi="Arial" w:cs="Arial"/>
@@ -363,26 +405,27 @@
       </w:pPr>
       <w:r>
         <w:rPr>
-          <w:rFonts w:ascii="Arial" w:hAnsi="Arial" w:cs="Arial"/>
-          <w:b/>
-          <w:sz w:val="20"/>
+          <w:rFonts w:ascii="Arial" w:hAnsi="Arial" w:cs="Arial" w:eastAsia="Arial"/>
+          <w:b w:val="0"/>
+          <w:color w:val="334155"/>
+          <w:sz w:val="16"/>
           <w:szCs w:val="20"/>
         </w:rPr>
-        <w:t xml:space="preserve">DevOps &amp; Quality: </w:t>
+        <w:t>DevOps &amp; Quality</w:t>
       </w:r>
       <w:r>
         <w:rPr>
-          <w:rFonts w:ascii="Arial" w:hAnsi="Arial" w:cs="Arial"/>
-          <w:bCs/>
-          <w:sz w:val="20"/>
-          <w:szCs w:val="20"/>
+          <w:rFonts w:ascii="Arial" w:hAnsi="Arial" w:eastAsia="Arial"/>
+          <w:b w:val="0"/>
+          <w:color w:val="334155"/>
+          <w:sz w:val="16"/>
         </w:rPr>
-        <w:t>Git, GitLab, GitHub, Docker, CI/CD, Vercel, Linux, Nginx, pytest, Vitest, Playwright</w:t>
+        <w:t>: Git, GitLab/GitHub CI, Docker, Vercel, Linux, Nginx, Playwright E2E, Jest, pytest, Vitest</w:t>
       </w:r>
     </w:p>
     <w:p>
       <w:pPr>
-        <w:spacing w:after="60" w:line="360" w:lineRule="auto"/>
+        <w:spacing w:after="11" w:line="240" w:lineRule="auto" w:before="0"/>
         <w:jc w:val="both"/>
         <w:rPr>
           <w:rFonts w:ascii="Arial" w:hAnsi="Arial" w:cs="Arial"/>
@@ -393,18 +436,21 @@
       </w:pPr>
       <w:r>
         <w:rPr>
-          <w:rFonts w:ascii="Arial" w:hAnsi="Arial" w:cs="Arial"/>
-          <w:b/>
-          <w:sz w:val="20"/>
+          <w:rFonts w:ascii="Arial" w:hAnsi="Arial" w:cs="Arial" w:eastAsia="Arial"/>
+          <w:b w:val="0"/>
+          <w:color w:val="334155"/>
+          <w:sz w:val="16"/>
           <w:szCs w:val="20"/>
         </w:rPr>
         <w:t xml:space="preserve">Practices: </w:t>
       </w:r>
       <w:r>
         <w:rPr>
-          <w:rFonts w:ascii="Arial" w:hAnsi="Arial" w:cs="Arial"/>
+          <w:rFonts w:ascii="Arial" w:hAnsi="Arial" w:cs="Arial" w:eastAsia="Arial"/>
+          <w:b w:val="0"/>
           <w:bCs/>
-          <w:sz w:val="20"/>
+          <w:color w:val="334155"/>
+          <w:sz w:val="16"/>
           <w:szCs w:val="20"/>
         </w:rPr>
         <w:t>Agile/Scrum, Code Review, WCAG Accessibility, TypeScript Strict, ESLint, Prettier</w:t>
@@ -412,7 +458,7 @@
     </w:p>
     <w:p>
       <w:pPr>
-        <w:spacing w:after="60" w:line="360" w:lineRule="auto"/>
+        <w:spacing w:after="11" w:line="240" w:lineRule="auto" w:before="0"/>
         <w:jc w:val="both"/>
         <w:rPr>
           <w:rFonts w:ascii="Arial" w:hAnsi="Arial" w:cs="Arial"/>
@@ -423,18 +469,21 @@
       </w:pPr>
       <w:r>
         <w:rPr>
-          <w:rFonts w:ascii="Arial" w:hAnsi="Arial" w:cs="Arial"/>
-          <w:b/>
-          <w:sz w:val="20"/>
+          <w:rFonts w:ascii="Arial" w:hAnsi="Arial" w:cs="Arial" w:eastAsia="Arial"/>
+          <w:b w:val="0"/>
+          <w:color w:val="334155"/>
+          <w:sz w:val="16"/>
           <w:szCs w:val="20"/>
         </w:rPr>
         <w:t xml:space="preserve">Languages: </w:t>
       </w:r>
       <w:r>
         <w:rPr>
-          <w:rFonts w:ascii="Arial" w:hAnsi="Arial" w:cs="Arial"/>
+          <w:rFonts w:ascii="Arial" w:hAnsi="Arial" w:cs="Arial" w:eastAsia="Arial"/>
+          <w:b w:val="0"/>
           <w:bCs/>
-          <w:sz w:val="20"/>
+          <w:color w:val="334155"/>
+          <w:sz w:val="16"/>
           <w:szCs w:val="20"/>
         </w:rPr>
         <w:t>Arabic (Native), English (Professional), French (Intermediate)</w:t>
@@ -443,7 +492,9 @@
     <w:p>
       <w:pPr>
         <w:pStyle w:val="Heading1"/>
-        <w:spacing w:line="360" w:lineRule="auto"/>
+        <w:keepNext/>
+        <w:spacing w:line="240" w:lineRule="auto" w:before="84" w:after="32"/>
+        <w:jc w:val="left"/>
         <w:rPr>
           <w:rFonts w:ascii="Arial" w:hAnsi="Arial" w:cs="Arial"/>
           <w:color w:val="003366"/>
@@ -452,45 +503,18 @@
       </w:pPr>
       <w:r>
         <w:rPr>
-          <w:rFonts w:ascii="Arial" w:hAnsi="Arial" w:cs="Arial"/>
-          <w:color w:val="003366"/>
-          <w:sz w:val="24"/>
+          <w:rFonts w:ascii="Arial" w:hAnsi="Arial" w:cs="Arial" w:eastAsia="Arial"/>
+          <w:b/>
+          <w:color w:val="0D9488"/>
+          <w:sz w:val="18"/>
         </w:rPr>
         <w:t>PROFESSIONAL EXPERIENCE</w:t>
       </w:r>
     </w:p>
     <w:p>
       <w:pPr>
-        <w:spacing w:after="60" w:line="360" w:lineRule="auto"/>
-        <w:rPr>
-          <w:rFonts w:ascii="Arial" w:hAnsi="Arial" w:cs="Arial"/>
-          <w:i/>
-          <w:sz w:val="20"/>
-          <w:szCs w:val="20"/>
-        </w:rPr>
-      </w:pPr>
-      <w:r>
-        <w:rPr>
-          <w:rFonts w:ascii="Arial" w:hAnsi="Arial" w:cs="Arial"/>
-          <w:b/>
-        </w:rPr>
-        <w:t xml:space="preserve">Senior </w:t>
-      </w:r>
-      <w:r>
-        <w:rPr>
-          <w:rFonts w:ascii="Arial" w:hAnsi="Arial" w:cs="Arial"/>
-          <w:b/>
-        </w:rPr>
-        <w:t>Full Stack Developer</w:t>
-      </w:r>
-      <w:r>
-        <w:rPr>
-          <w:rFonts w:ascii="Arial" w:hAnsi="Arial" w:cs="Arial"/>
-          <w:b/>
-        </w:rPr>
-        <w:br/>
-      </w:r>
-      <w:r>
+        <w:keepNext/>
+        <w:spacing w:after="16" w:line="240" w:lineRule="auto" w:before="68"/>
         <w:rPr>
           <w:rFonts w:ascii="Arial" w:hAnsi="Arial" w:cs="Arial"/>
           <w:b/>
@@ -499,38 +523,43 @@
           <w:sz w:val="20"/>
           <w:szCs w:val="20"/>
         </w:rPr>
-        <w:t>Talio</w:t>
+      </w:pPr>
+      <w:r>
+        <w:rPr>
+          <w:rFonts w:ascii="Arial" w:hAnsi="Arial" w:eastAsia="Arial"/>
+          <w:b/>
+          <w:bCs/>
+          <w:color w:val="0F172A"/>
+          <w:sz w:val="17"/>
+        </w:rPr>
+        <w:t>Senior Full-Stack Developer (Contract)</w:t>
       </w:r>
       <w:r>
         <w:rPr>
-          <w:rFonts w:ascii="Arial" w:hAnsi="Arial" w:cs="Arial"/>
-          <w:i/>
-          <w:sz w:val="20"/>
+          <w:rFonts w:ascii="Arial" w:hAnsi="Arial" w:eastAsia="Arial"/>
+          <w:b/>
+          <w:bCs/>
+          <w:color w:val="0F172A"/>
+          <w:sz w:val="17"/>
+        </w:rPr>
+        <w:br/>
+      </w:r>
+      <w:r>
+        <w:rPr>
+          <w:rFonts w:ascii="Arial" w:hAnsi="Arial" w:eastAsia="Arial"/>
+          <w:b/>
+          <w:bCs/>
+          <w:color w:val="0F172A"/>
+          <w:sz w:val="17"/>
           <w:szCs w:val="20"/>
         </w:rPr>
-        <w:t xml:space="preserve"> | Remote (Paris, France) | February 2026 – Present</w:t>
+        <w:t>Talio | Remote, France | February 2026 - August 2026</w:t>
       </w:r>
     </w:p>
     <w:p>
       <w:pPr>
-        <w:spacing w:after="60" w:line="360" w:lineRule="auto"/>
-        <w:rPr>
-          <w:rFonts w:ascii="Arial" w:hAnsi="Arial" w:cs="Arial"/>
-          <w:i/>
-          <w:sz w:val="20"/>
-          <w:szCs w:val="20"/>
-        </w:rPr>
-      </w:pPr>
-      <w:r>
-        <w:rPr>
-          <w:rFonts w:ascii="Arial" w:hAnsi="Arial" w:cs="Arial"/>
-          <w:i/>
-          <w:sz w:val="20"/>
-          <w:szCs w:val="20"/>
-        </w:rPr>
-        <w:t xml:space="preserve">Client: </w:t>
-      </w:r>
-      <w:r>
+        <w:keepNext/>
+        <w:spacing w:after="14" w:line="240" w:lineRule="auto" w:before="40"/>
         <w:rPr>
           <w:rFonts w:ascii="Arial" w:hAnsi="Arial" w:cs="Arial"/>
           <w:b/>
@@ -539,21 +568,257 @@
           <w:sz w:val="20"/>
           <w:szCs w:val="20"/>
         </w:rPr>
-        <w:t>Creaboost</w:t>
+      </w:pPr>
+      <w:r>
+        <w:rPr>
+          <w:rFonts w:ascii="Arial" w:hAnsi="Arial" w:eastAsia="Arial"/>
+          <w:b w:val="0"/>
+          <w:bCs/>
+          <w:color w:val="1E293B"/>
+          <w:sz w:val="16"/>
+          <w:szCs w:val="20"/>
+        </w:rPr>
+        <w:t>Client Project: Creaboost | AI-powered creative content platform | February 2026 - May 2026 | Scope completed</w:t>
       </w:r>
-      <w:r>
+    </w:p>
+    <w:p>
+      <w:pPr>
+        <w:spacing w:after="11" w:line="240" w:lineRule="auto" w:before="0"/>
         <w:rPr>
           <w:rFonts w:ascii="Arial" w:hAnsi="Arial" w:cs="Arial"/>
           <w:i/>
           <w:sz w:val="20"/>
           <w:szCs w:val="20"/>
         </w:rPr>
-        <w:t xml:space="preserve"> | AI-powered creative content platform | February 2026 – May 2026</w:t>
+      </w:pPr>
+      <w:r>
+        <w:rPr>
+          <w:rFonts w:ascii="Arial" w:hAnsi="Arial" w:cs="Arial" w:eastAsia="Arial"/>
+          <w:b w:val="0"/>
+          <w:i/>
+          <w:color w:val="334155"/>
+          <w:sz w:val="16"/>
+          <w:szCs w:val="20"/>
+        </w:rPr>
+        <w:t>Stack: Next.js 14, React 18, TypeScript, Node.js, Express, GenAI, BullMQ Pro, Supabase, Redis, Bunny CDN</w:t>
       </w:r>
     </w:p>
     <w:p>
       <w:pPr>
-        <w:spacing w:after="60" w:line="360" w:lineRule="auto"/>
+        <w:spacing w:after="16" w:line="240" w:lineRule="auto" w:before="0"/>
+        <w:ind w:left="202" w:hanging="173"/>
+        <w:rPr>
+          <w:rFonts w:cs="Arial"/>
+        </w:rPr>
+      </w:pPr>
+      <w:r>
+        <w:rPr>
+          <w:rFonts w:ascii="Arial" w:hAnsi="Arial" w:eastAsia="Arial"/>
+          <w:b w:val="0"/>
+          <w:color w:val="1E293B"/>
+          <w:sz w:val="16"/>
+        </w:rPr>
+        <w:t>- Architected a GenAI-powered brand import pipeline leveraging Google Gemini for automated content analysis, integrating external scraping tools (Firecrawl, ScrapingBee) with a BullMQ Pro background job queue and per-workspace rate limiting.</w:t>
+      </w:r>
+    </w:p>
+    <w:p>
+      <w:pPr>
+        <w:spacing w:after="16" w:line="240" w:lineRule="auto" w:before="0"/>
+        <w:ind w:left="202" w:hanging="173"/>
+        <w:rPr>
+          <w:rFonts w:cs="Arial"/>
+        </w:rPr>
+      </w:pPr>
+      <w:r>
+        <w:rPr>
+          <w:rFonts w:ascii="Arial" w:hAnsi="Arial" w:eastAsia="Arial"/>
+          <w:b w:val="0"/>
+          <w:color w:val="1E293B"/>
+          <w:sz w:val="16"/>
+        </w:rPr>
+        <w:t>- Developed a comprehensive media asset library featuring batch drag-and-drop uploads, client-side deduplication, and automated server-side image conversion (SVG to PNG) via Sharp and resvg-js, served via Bunny CDN.</w:t>
+      </w:r>
+    </w:p>
+    <w:p>
+      <w:pPr>
+        <w:spacing w:after="16" w:line="240" w:lineRule="auto" w:before="0"/>
+        <w:ind w:left="202" w:hanging="173"/>
+        <w:rPr>
+          <w:rFonts w:cs="Arial"/>
+        </w:rPr>
+      </w:pPr>
+      <w:r>
+        <w:rPr>
+          <w:rFonts w:ascii="Arial" w:hAnsi="Arial" w:eastAsia="Arial"/>
+          <w:b w:val="0"/>
+          <w:color w:val="1E293B"/>
+          <w:sz w:val="16"/>
+        </w:rPr>
+        <w:t>- Optimized frontend performance by building reusable, cursor-based infinite scroll React hooks with IntersectionObserver, standardizing data fetching and eliminating code duplication.</w:t>
+      </w:r>
+    </w:p>
+    <w:p>
+      <w:pPr>
+        <w:spacing w:after="16" w:line="240" w:lineRule="auto" w:before="0"/>
+        <w:ind w:left="202" w:hanging="173"/>
+        <w:rPr>
+          <w:rFonts w:cs="Arial"/>
+        </w:rPr>
+      </w:pPr>
+      <w:r>
+        <w:rPr>
+          <w:rFonts w:ascii="Arial" w:hAnsi="Arial" w:eastAsia="Arial"/>
+          <w:b w:val="0"/>
+          <w:color w:val="1E293B"/>
+          <w:sz w:val="16"/>
+        </w:rPr>
+        <w:t>- Supported production delivery through Supabase database migrations, upload pipeline security audits, Vercel deployment workflows, and accessible responsive UI features.</w:t>
+      </w:r>
+    </w:p>
+    <w:p>
+      <w:pPr>
+        <w:keepNext/>
+        <w:spacing w:before="68" w:after="16" w:line="240" w:lineRule="auto"/>
+      </w:pPr>
+      <w:r>
+        <w:rPr>
+          <w:rFonts w:ascii="Arial" w:hAnsi="Arial" w:eastAsia="Arial"/>
+          <w:b/>
+          <w:color w:val="0F172A"/>
+          <w:sz w:val="17"/>
+        </w:rPr>
+        <w:t>Full-Stack Developer (Client Contract)</w:t>
+      </w:r>
+    </w:p>
+    <w:p>
+      <w:pPr>
+        <w:keepNext/>
+        <w:spacing w:before="40" w:after="14" w:line="240" w:lineRule="auto"/>
+        <w:rPr>
+          <w:rFonts w:ascii="Arial" w:hAnsi="Arial" w:cs="Arial"/>
+          <w:b/>
+        </w:rPr>
+      </w:pPr>
+      <w:r>
+        <w:rPr>
+          <w:rFonts w:ascii="Arial" w:hAnsi="Arial" w:eastAsia="Arial"/>
+          <w:b w:val="0"/>
+          <w:color w:val="1E293B"/>
+          <w:sz w:val="16"/>
+        </w:rPr>
+        <w:t>Indus Inspection | Remote | October 2025 - Present</w:t>
+      </w:r>
+    </w:p>
+    <w:p>
+      <w:pPr>
+        <w:keepNext/>
+        <w:spacing w:before="40" w:after="14" w:line="240" w:lineRule="auto"/>
+      </w:pPr>
+      <w:r>
+        <w:rPr>
+          <w:rFonts w:ascii="Arial" w:hAnsi="Arial" w:eastAsia="Arial"/>
+          <w:b w:val="0"/>
+          <w:color w:val="1E293B"/>
+          <w:sz w:val="16"/>
+        </w:rPr>
+        <w:t>Industrial Drone Inspection Platform | Client Product | Early Product Team / Full-Stack Developer</w:t>
+      </w:r>
+    </w:p>
+    <w:p>
+      <w:pPr>
+        <w:spacing w:before="0" w:after="11" w:line="240" w:lineRule="auto"/>
+      </w:pPr>
+      <w:r>
+        <w:rPr>
+          <w:rFonts w:ascii="Arial" w:hAnsi="Arial" w:eastAsia="Arial"/>
+          <w:b w:val="0"/>
+          <w:color w:val="334155"/>
+          <w:sz w:val="16"/>
+        </w:rPr>
+        <w:t>Stack: Next.js 16, React 19, TypeScript, FastAPI, PostgreSQL, Prisma, Better Auth, Celery, Redis, YOLOv8, ONNX Runtime, OpenCV, PyProj, MapLibre GL, React Konva</w:t>
+      </w:r>
+    </w:p>
+    <CT_P>
+      <w:r>
+        <w:t>Industrial Drone Inspection Platform | Client Product | Early Product Team / Full-Stack Developer</w:t>
+      </w:r>
+    </CT_P>
+    <w:p>
+      <w:pPr>
+        <w:spacing w:after="16" w:line="240" w:lineRule="auto" w:before="0"/>
+        <w:ind w:left="202" w:hanging="173"/>
+        <w:rPr>
+          <w:rFonts w:cs="Arial"/>
+        </w:rPr>
+      </w:pPr>
+      <w:r>
+        <w:rPr>
+          <w:rFonts w:ascii="Arial" w:hAnsi="Arial" w:eastAsia="Arial"/>
+          <w:b w:val="0"/>
+          <w:color w:val="1E293B"/>
+          <w:sz w:val="16"/>
+        </w:rPr>
+        <w:t>- Built a full-stack industrial inspection platform for towers/pylons, wind, and solar assets, connecting drone imagery, engineering-plan calibration, AI-assisted defect review, and client-ready exports.</w:t>
+      </w:r>
+    </w:p>
+    <w:p>
+      <w:pPr>
+        <w:spacing w:after="16" w:line="240" w:lineRule="auto" w:before="0"/>
+        <w:ind w:left="202" w:hanging="173"/>
+        <w:rPr>
+          <w:rFonts w:cs="Arial"/>
+        </w:rPr>
+      </w:pPr>
+      <w:r>
+        <w:rPr>
+          <w:rFonts w:ascii="Arial" w:hAnsi="Arial" w:eastAsia="Arial"/>
+          <w:b w:val="0"/>
+          <w:color w:val="1E293B"/>
+          <w:sz w:val="16"/>
+        </w:rPr>
+        <w:t>- Engineered an async FastAPI/Celery/Redis pipeline with YOLOv8/ONNX inference, SSE job progress, bounding-box storage, severity scoring, reviewer overrides, and PDF/ZIP export packaging.</w:t>
+      </w:r>
+    </w:p>
+    <w:p>
+      <w:pPr>
+        <w:spacing w:after="16" w:line="240" w:lineRule="auto" w:before="0"/>
+        <w:ind w:left="202" w:hanging="173"/>
+        <w:rPr>
+          <w:rFonts w:cs="Arial"/>
+        </w:rPr>
+      </w:pPr>
+      <w:r>
+        <w:rPr>
+          <w:rFonts w:ascii="Arial" w:hAnsi="Arial" w:eastAsia="Arial"/>
+          <w:b w:val="0"/>
+          <w:color w:val="1E293B"/>
+          <w:sz w:val="16"/>
+        </w:rPr>
+        <w:t>- Implemented geospatial image positioning with OpenCV plan analysis, EXIF metadata, PyProj coordinate transforms, a Konva plan viewer, and MapLibre workspace maps.</w:t>
+      </w:r>
+    </w:p>
+    <w:p>
+      <w:pPr>
+        <w:spacing w:after="16" w:line="240" w:lineRule="auto" w:before="0"/>
+        <w:ind w:left="202" w:hanging="173"/>
+        <w:rPr>
+          <w:rFonts w:cs="Arial"/>
+        </w:rPr>
+      </w:pPr>
+      <w:r>
+        <w:rPr>
+          <w:rFonts w:ascii="Arial" w:hAnsi="Arial" w:eastAsia="Arial"/>
+          <w:b w:val="0"/>
+          <w:color w:val="1E293B"/>
+          <w:sz w:val="16"/>
+        </w:rPr>
+        <w:t>- Hardened auth and operations with Better Auth, server-side token isolation, workspace/project role gates, database migrations, upload-size middleware, and invitation flows.</w:t>
+      </w:r>
+    </w:p>
+    <w:p>
+      <w:pPr>
+        <w:keepNext/>
+        <w:spacing w:after="16" w:line="240" w:lineRule="auto" w:before="68"/>
         <w:rPr>
           <w:rFonts w:ascii="Arial" w:hAnsi="Arial" w:cs="Arial"/>
           <w:i/>
@@ -563,18 +828,152 @@
       </w:pPr>
       <w:r>
         <w:rPr>
-          <w:rFonts w:ascii="Arial" w:hAnsi="Arial" w:cs="Arial"/>
-          <w:i/>
-          <w:sz w:val="20"/>
+          <w:rFonts w:ascii="Arial" w:hAnsi="Arial" w:eastAsia="Arial"/>
+          <w:b/>
+          <w:bCs/>
+          <w:color w:val="0F172A"/>
+          <w:sz w:val="17"/>
+        </w:rPr>
+        <w:t>Full-Stack Developer</w:t>
+      </w:r>
+      <w:r>
+        <w:rPr>
+          <w:rFonts w:ascii="Arial" w:hAnsi="Arial" w:eastAsia="Arial"/>
+          <w:b/>
+          <w:color w:val="0F172A"/>
+          <w:sz w:val="17"/>
+        </w:rPr>
+        <w:br/>
+      </w:r>
+      <w:r>
+        <w:rPr>
+          <w:rFonts w:ascii="Arial" w:hAnsi="Arial" w:eastAsia="Arial"/>
+          <w:b/>
+          <w:bCs/>
+          <w:color w:val="0F172A"/>
+          <w:sz w:val="17"/>
           <w:szCs w:val="20"/>
         </w:rPr>
-        <w:t>Stack: Next.js 14, React 18, TypeScript, Node.js, Express, GenAI, BullMQ Pro, Supabase, Redis, Bunny CDN</w:t>
+        <w:t>DR STONE | Casablanca, Morocco | July 2022 - January 2026</w:t>
       </w:r>
     </w:p>
     <w:p>
       <w:pPr>
-        <w:pStyle w:val="ListBullet"/>
-        <w:spacing w:after="40" w:line="360" w:lineRule="auto"/>
+        <w:keepNext/>
+        <w:spacing w:after="14" w:line="240" w:lineRule="auto" w:before="40"/>
+        <w:rPr>
+          <w:rFonts w:ascii="Arial" w:hAnsi="Arial" w:cs="Arial"/>
+          <w:b/>
+        </w:rPr>
+      </w:pPr>
+      <w:r>
+        <w:rPr>
+          <w:rFonts w:ascii="Arial" w:hAnsi="Arial" w:eastAsia="Arial"/>
+          <w:b w:val="0"/>
+          <w:bCs/>
+          <w:color w:val="1E293B"/>
+          <w:sz w:val="16"/>
+          <w:szCs w:val="20"/>
+        </w:rPr>
+        <w:t>Dr Turbine | In-development Wind Turbine Inspection Platform</w:t>
+      </w:r>
+      <w:r>
+        <w:rPr>
+          <w:rFonts w:ascii="Arial" w:hAnsi="Arial" w:eastAsia="Arial"/>
+          <w:b w:val="0"/>
+          <w:color w:val="1E293B"/>
+          <w:sz w:val="16"/>
+        </w:rPr>
+        <w:br/>
+        <w:t>Pre-production platform; metrics reflect pilot/test workflow usage</w:t>
+      </w:r>
+      <w:r>
+        <w:rPr>
+          <w:rFonts w:ascii="Arial" w:hAnsi="Arial" w:eastAsia="Arial"/>
+          <w:b w:val="0"/>
+          <w:color w:val="1E293B"/>
+          <w:sz w:val="16"/>
+        </w:rPr>
+        <w:br/>
+        <w:t>Stack: Next.js 15, React 19, TypeScript, Node.js, MySQL, Socket.IO, Prisma, shadcn/ui</w:t>
+      </w:r>
+    </w:p>
+    <w:p>
+      <w:pPr>
+        <w:spacing w:after="16" w:line="240" w:lineRule="auto" w:before="0"/>
+        <w:ind w:left="202" w:hanging="173"/>
+        <w:rPr>
+          <w:rFonts w:cs="Arial"/>
+        </w:rPr>
+      </w:pPr>
+      <w:r>
+        <w:rPr>
+          <w:rFonts w:ascii="Arial" w:hAnsi="Arial" w:eastAsia="Arial"/>
+          <w:b w:val="0"/>
+          <w:color w:val="1E293B"/>
+          <w:sz w:val="16"/>
+        </w:rPr>
+        <w:t>- Built frontend architecture and image-review workflows for a pre-production inspection product handling 10,000+ drone images per month in pilot/test operations, supporting AI-assisted damage review with reported model accuracy up to 95% in testing.</w:t>
+      </w:r>
+    </w:p>
+    <w:p>
+      <w:pPr>
+        <w:spacing w:after="16" w:line="240" w:lineRule="auto" w:before="0"/>
+        <w:ind w:left="202" w:hanging="173"/>
+        <w:rPr>
+          <w:rFonts w:cs="Arial"/>
+        </w:rPr>
+      </w:pPr>
+      <w:r>
+        <w:rPr>
+          <w:rFonts w:ascii="Arial" w:hAnsi="Arial" w:eastAsia="Arial"/>
+          <w:b w:val="0"/>
+          <w:color w:val="1E293B"/>
+          <w:sz w:val="16"/>
+        </w:rPr>
+        <w:t>- Built real-time collaborative annotation workflows with Socket.IO, enabling 5+ concurrent inspectors to review and label imagery in the same workspace.</w:t>
+      </w:r>
+    </w:p>
+    <w:p>
+      <w:pPr>
+        <w:spacing w:after="16" w:line="240" w:lineRule="auto" w:before="0"/>
+        <w:ind w:left="202" w:hanging="173"/>
+        <w:rPr>
+          <w:rFonts w:cs="Arial"/>
+        </w:rPr>
+      </w:pPr>
+      <w:r>
+        <w:rPr>
+          <w:rFonts w:ascii="Arial" w:hAnsi="Arial" w:eastAsia="Arial"/>
+          <w:b w:val="0"/>
+          <w:color w:val="1E293B"/>
+          <w:sz w:val="16"/>
+        </w:rPr>
+        <w:t>- Optimized React rendering for large image datasets using lazy loading, virtualization, and Canvas-based overlays</w:t>
+      </w:r>
+    </w:p>
+    <w:p>
+      <w:pPr>
+        <w:spacing w:after="16" w:line="240" w:lineRule="auto" w:before="0"/>
+        <w:ind w:left="202" w:hanging="173"/>
+        <w:rPr>
+          <w:rFonts w:cs="Arial"/>
+        </w:rPr>
+      </w:pPr>
+      <w:r>
+        <w:rPr>
+          <w:rFonts w:ascii="Arial" w:hAnsi="Arial" w:eastAsia="Arial"/>
+          <w:b w:val="0"/>
+          <w:color w:val="1E293B"/>
+          <w:sz w:val="16"/>
+        </w:rPr>
+        <w:t>- Automated drone-image metadata extraction and ingestion workflows, reducing manual data entry by 80% in internal inspection workflows.</w:t>
+      </w:r>
+    </w:p>
+    <w:p>
+      <w:pPr>
+        <w:keepNext/>
+        <w:spacing w:after="14" w:line="240" w:lineRule="auto" w:before="40"/>
         <w:rPr>
           <w:rFonts w:ascii="Arial" w:hAnsi="Arial" w:cs="Arial"/>
           <w:sz w:val="20"/>
@@ -583,17 +982,31 @@
       </w:pPr>
       <w:r>
         <w:rPr>
-          <w:rFonts w:ascii="Arial" w:hAnsi="Arial" w:cs="Arial"/>
-          <w:sz w:val="20"/>
+          <w:rFonts w:ascii="Arial" w:hAnsi="Arial" w:eastAsia="Arial"/>
+          <w:b w:val="0"/>
+          <w:bCs/>
+          <w:color w:val="1E293B"/>
+          <w:sz w:val="16"/>
           <w:szCs w:val="20"/>
         </w:rPr>
-        <w:t>Architected a GenAI-powered brand import pipeline leveraging Google Gemini for automated content analysis, integrating external scraping tools (Firecrawl, ScrapingBee) with a BullMQ Pro background job queue and per-workspace rate limiting.</w:t>
+        <w:lastRenderedPageBreak/>
+        <w:t>FILAHI | Production Precision Agriculture SaaS Platform</w:t>
+      </w:r>
+      <w:r>
+        <w:rPr>
+          <w:rFonts w:ascii="Arial" w:hAnsi="Arial" w:eastAsia="Arial"/>
+          <w:b w:val="0"/>
+          <w:color w:val="1E293B"/>
+          <w:sz w:val="16"/>
+        </w:rPr>
+        <w:br/>
+        <w:t>Stack: Next.js, TypeScript, Node.js, MySQL, Prisma, NextAuth, Leaflet.js, shadcn/ui</w:t>
       </w:r>
     </w:p>
     <w:p>
       <w:pPr>
-        <w:pStyle w:val="ListBullet"/>
-        <w:spacing w:after="40" w:line="360" w:lineRule="auto"/>
+        <w:spacing w:after="16" w:line="240" w:lineRule="auto" w:before="0"/>
+        <w:ind w:left="202" w:hanging="173"/>
         <w:rPr>
           <w:rFonts w:ascii="Arial" w:hAnsi="Arial" w:cs="Arial"/>
           <w:sz w:val="20"/>
@@ -602,17 +1015,18 @@
       </w:pPr>
       <w:r>
         <w:rPr>
-          <w:rFonts w:ascii="Arial" w:hAnsi="Arial" w:cs="Arial"/>
-          <w:sz w:val="20"/>
-          <w:szCs w:val="20"/>
+          <w:rFonts w:ascii="Arial" w:hAnsi="Arial" w:eastAsia="Arial"/>
+          <w:b w:val="0"/>
+          <w:color w:val="1E293B"/>
+          <w:sz w:val="16"/>
         </w:rPr>
-        <w:t>Developed a comprehensive media asset library featuring batch drag-and-drop uploads, client-side deduplication, and automated server-side image conversion (SVG to PNG) via Sharp and resvg-js, served via Bunny CDN.</w:t>
+        <w:t>- Built and shipped production features for a precision-agriculture SaaS platform used by 500+ farmers managing 2,000+ plots, including geospatial workflows and AI-assisted crop analysis.</w:t>
       </w:r>
     </w:p>
     <w:p>
       <w:pPr>
-        <w:pStyle w:val="ListBullet"/>
-        <w:spacing w:after="40" w:line="360" w:lineRule="auto"/>
+        <w:spacing w:after="16" w:line="240" w:lineRule="auto" w:before="0"/>
+        <w:ind w:left="202" w:hanging="173"/>
         <w:rPr>
           <w:rFonts w:ascii="Arial" w:hAnsi="Arial" w:cs="Arial"/>
           <w:sz w:val="20"/>
@@ -621,17 +1035,18 @@
       </w:pPr>
       <w:r>
         <w:rPr>
-          <w:rFonts w:ascii="Arial" w:hAnsi="Arial" w:cs="Arial"/>
-          <w:sz w:val="20"/>
-          <w:szCs w:val="20"/>
+          <w:rFonts w:ascii="Arial" w:hAnsi="Arial" w:eastAsia="Arial"/>
+          <w:b w:val="0"/>
+          <w:color w:val="1E293B"/>
+          <w:sz w:val="16"/>
         </w:rPr>
-        <w:t>Optimized frontend performance by building reusable, cursor-based infinite scroll React hooks with IntersectionObserver, standardizing data fetching and eliminating code duplication.</w:t>
+        <w:t>- Built interactive geospatial mapping and satellite-data visualization features using Leaflet.js for plot-level monitoring workflows.</w:t>
       </w:r>
     </w:p>
     <w:p>
       <w:pPr>
-        <w:pStyle w:val="ListBullet"/>
-        <w:spacing w:after="40" w:line="360" w:lineRule="auto"/>
+        <w:spacing w:after="16" w:line="240" w:lineRule="auto" w:before="0"/>
+        <w:ind w:left="202" w:hanging="173"/>
         <w:rPr>
           <w:rFonts w:ascii="Arial" w:hAnsi="Arial" w:cs="Arial"/>
           <w:sz w:val="20"/>
@@ -640,620 +1055,171 @@
       </w:pPr>
       <w:r>
         <w:rPr>
+          <w:rFonts w:ascii="Arial" w:hAnsi="Arial" w:eastAsia="Arial"/>
+          <w:b w:val="0"/>
+          <w:color w:val="1E293B"/>
+          <w:sz w:val="16"/>
+        </w:rPr>
+        <w:t>- Optimized MySQL queries and caching, improving API response time by 45% and reducing report generation time by 70%.</w:t>
+      </w:r>
+    </w:p>
+    <w:p>
+      <w:pPr>
+        <w:spacing w:after="11" w:line="240" w:lineRule="auto" w:before="0"/>
+        <w:rPr>
           <w:rFonts w:ascii="Arial" w:hAnsi="Arial" w:cs="Arial"/>
           <w:sz w:val="20"/>
           <w:szCs w:val="20"/>
         </w:rPr>
-        <w:t>Designed complex, responsive UI features (multi-step wizards, accessible lightboxes) while securing backend infrastructure via Supabase database migrations and upload pipeline security audits.</w:t>
+      </w:pPr>
+      <w:r>
+        <w:rPr>
+          <w:rFonts w:ascii="Arial" w:hAnsi="Arial" w:eastAsia="Arial"/>
+          <w:b w:val="0"/>
+          <w:color w:val="334155"/>
+          <w:sz w:val="16"/>
+        </w:rPr>
+        <w:t>Additional Projects: Built web, mobile (React Native/Expo), and desktop (Electron) applications with Node.js APIs, authentication, database-backed features, Playwright/Jest testing, GitHub/GitLab CI, and Vercel/Nginx deployments.</w:t>
       </w:r>
     </w:p>
     <w:p>
       <w:pPr>
-        <w:spacing w:before="120" w:after="60" w:line="360" w:lineRule="auto"/>
+        <w:keepNext/>
+        <w:spacing w:after="16" w:line="240" w:lineRule="auto" w:before="68"/>
         <w:rPr>
-          <w:rFonts w:ascii="Arial" w:hAnsi="Arial" w:cs="Arial"/>
           <w:b/>
+          <w:bCs/>
+          <w:sz w:val="20"/>
+          <w:szCs w:val="20"/>
         </w:rPr>
       </w:pPr>
       <w:r>
         <w:rPr>
-          <w:rFonts w:ascii="Arial" w:hAnsi="Arial" w:cs="Arial"/>
+          <w:rFonts w:cs="Arial" w:ascii="Arial" w:hAnsi="Arial" w:eastAsia="Arial"/>
           <w:b/>
+          <w:color w:val="0F172A"/>
+          <w:sz w:val="17"/>
         </w:rPr>
-        <w:lastRenderedPageBreak/>
-        <w:t xml:space="preserve">Indus Inspection </w:t>
+        <w:t>Freelance Web Developer</w:t>
       </w:r>
       <w:r>
         <w:rPr>
-          <w:rFonts w:ascii="Arial" w:hAnsi="Arial" w:cs="Arial"/>
+          <w:rFonts w:ascii="Arial" w:hAnsi="Arial" w:cs="Arial" w:eastAsia="Arial"/>
           <w:b/>
-        </w:rPr>
-        <w:t>-</w:t>
-      </w:r>
-      <w:r>
-        <w:rPr>
-          <w:rFonts w:ascii="Arial" w:hAnsi="Arial" w:cs="Arial"/>
-          <w:b/>
-        </w:rPr>
-        <w:t xml:space="preserve"> Industrial Drone Inspection Platform</w:t>
-      </w:r>
-      <w:r>
-        <w:rPr>
-          <w:rFonts w:ascii="Arial" w:hAnsi="Arial" w:cs="Arial"/>
-          <w:b/>
+          <w:color w:val="0F172A"/>
+          <w:sz w:val="17"/>
         </w:rPr>
         <w:br/>
       </w:r>
       <w:r>
         <w:rPr>
-          <w:rFonts w:ascii="Arial" w:hAnsi="Arial" w:cs="Arial"/>
-          <w:i/>
-          <w:sz w:val="20"/>
+          <w:rFonts w:ascii="Arial" w:hAnsi="Arial" w:eastAsia="Arial"/>
+          <w:b/>
+          <w:bCs/>
+          <w:color w:val="0F172A"/>
+          <w:sz w:val="17"/>
           <w:szCs w:val="20"/>
         </w:rPr>
-        <w:t>Independent Project | 2026</w:t>
-      </w:r>
-      <w:r>
-        <w:rPr>
-          <w:rFonts w:ascii="Arial" w:hAnsi="Arial" w:cs="Arial"/>
-          <w:i/>
-          <w:sz w:val="20"/>
-          <w:szCs w:val="20"/>
-        </w:rPr>
-        <w:br/>
-        <w:t>Stack: Next.js 16, React 19, TypeScript, FastAPI, PostgreSQL/Prisma, Better Auth, Celery/Redis, YOLOv8/ONNX, OpenCV, PyProj, MapLibreGL, react-konva</w:t>
+        <w:t>Self-Employed | Remote | 2020 - 2022</w:t>
       </w:r>
     </w:p>
     <w:p>
       <w:pPr>
-        <w:pStyle w:val="ListBullet"/>
-        <w:spacing w:after="40" w:line="360" w:lineRule="auto"/>
+        <w:spacing w:after="16" w:line="240" w:lineRule="auto" w:before="0"/>
+        <w:ind w:left="202" w:hanging="173"/>
         <w:rPr>
-          <w:rFonts w:ascii="Arial" w:hAnsi="Arial" w:cs="Arial"/>
-          <w:sz w:val="20"/>
-          <w:szCs w:val="20"/>
+          <w:rFonts w:cs="Arial"/>
         </w:rPr>
       </w:pPr>
       <w:r>
         <w:rPr>
-          <w:rFonts w:ascii="Arial" w:hAnsi="Arial" w:cs="Arial"/>
-          <w:sz w:val="20"/>
-          <w:szCs w:val="20"/>
+          <w:rFonts w:ascii="Arial" w:hAnsi="Arial" w:eastAsia="Arial"/>
+          <w:b w:val="0"/>
+          <w:color w:val="1E293B"/>
+          <w:sz w:val="16"/>
         </w:rPr>
-        <w:t>Built a full-stack industrial inspection platform for towers/pylons, wind, and solar assets, connecting drone imagery, engineering-plan calibration, AI-assisted defect review, and client-ready exports.</w:t>
+        <w:t>- Developed responsive web applications using React.js, Bootstrap v4/v5, JavaScript, HTML5, and CSS3/SCSS for local client websites and product interfaces.</w:t>
       </w:r>
     </w:p>
     <w:p>
       <w:pPr>
-        <w:pStyle w:val="ListBullet"/>
-        <w:spacing w:after="40" w:line="360" w:lineRule="auto"/>
+        <w:spacing w:after="16" w:line="240" w:lineRule="auto" w:before="0"/>
+        <w:ind w:left="202" w:hanging="173"/>
         <w:rPr>
-          <w:rFonts w:ascii="Arial" w:hAnsi="Arial" w:cs="Arial"/>
-          <w:sz w:val="20"/>
-          <w:szCs w:val="20"/>
+          <w:rFonts w:cs="Arial"/>
         </w:rPr>
       </w:pPr>
       <w:r>
         <w:rPr>
-          <w:rFonts w:ascii="Arial" w:hAnsi="Arial" w:cs="Arial"/>
-          <w:sz w:val="20"/>
-          <w:szCs w:val="20"/>
+          <w:rFonts w:ascii="Arial" w:hAnsi="Arial" w:eastAsia="Arial"/>
+          <w:b w:val="0"/>
+          <w:color w:val="1E293B"/>
+          <w:sz w:val="16"/>
         </w:rPr>
-        <w:t>Engineered an async FastAPI/Celery/Redis pipeline with YOLOv8/ONNX inference, SSE job progress, bounding-box storage, severity scoring, reviewer overrides, and PDF/ZIP export packaging.</w:t>
+        <w:t>- Built responsive, cross-browser web interfaces for client projects, improving usability across mobile and desktop devices.</w:t>
       </w:r>
     </w:p>
     <w:p>
       <w:pPr>
-        <w:pStyle w:val="ListBullet"/>
-        <w:spacing w:after="40" w:line="360" w:lineRule="auto"/>
+        <w:pStyle w:val="Heading1"/>
+        <w:keepNext/>
+        <w:spacing w:line="240" w:lineRule="auto" w:before="84" w:after="32"/>
+        <w:jc w:val="left"/>
         <w:rPr>
-          <w:rFonts w:ascii="Arial" w:hAnsi="Arial" w:cs="Arial"/>
-          <w:sz w:val="20"/>
-          <w:szCs w:val="20"/>
-        </w:rPr>
-      </w:pPr>
-      <w:r>
-        <w:rPr>
-          <w:rFonts w:ascii="Arial" w:hAnsi="Arial" w:cs="Arial"/>
-          <w:sz w:val="20"/>
-          <w:szCs w:val="20"/>
-        </w:rPr>
-        <w:t>Implemented geospatial image positioning with OpenCV plan analysis, EXIF metadata, PyProj coordinate transforms, a Konva plan viewer, and MapLibre workspace maps.</w:t>
-      </w:r>
-    </w:p>
-    <w:p>
-      <w:pPr>
-        <w:pStyle w:val="ListBullet"/>
-        <w:spacing w:after="40" w:line="360" w:lineRule="auto"/>
-        <w:rPr>
-          <w:rFonts w:ascii="Arial" w:hAnsi="Arial" w:cs="Arial"/>
-          <w:sz w:val="20"/>
-          <w:szCs w:val="20"/>
-        </w:rPr>
-      </w:pPr>
-      <w:r>
-        <w:rPr>
-          <w:rFonts w:ascii="Arial" w:hAnsi="Arial" w:cs="Arial"/>
-          <w:sz w:val="20"/>
-          <w:szCs w:val="20"/>
-        </w:rPr>
-        <w:t>Hardened auth and operations with Better Auth, server-side token isolation, workspace/project role gates, upload-size middleware, and invitation flows.</w:t>
-      </w:r>
-    </w:p>
-    <w:p>
-      <w:pPr>
-        <w:spacing w:after="60" w:line="360" w:lineRule="auto"/>
-        <w:rPr>
-          <w:rFonts w:ascii="Arial" w:hAnsi="Arial" w:cs="Arial"/>
-          <w:i/>
-          <w:sz w:val="20"/>
-          <w:szCs w:val="20"/>
-        </w:rPr>
-      </w:pPr>
-      <w:r>
-        <w:rPr>
-          <w:rFonts w:ascii="Arial" w:hAnsi="Arial" w:cs="Arial"/>
-          <w:b/>
-        </w:rPr>
-        <w:t>Senior Frontend Developer | Full Stack</w:t>
-      </w:r>
-      <w:r>
-        <w:rPr>
-          <w:rFonts w:ascii="Arial" w:hAnsi="Arial" w:cs="Arial"/>
-          <w:b/>
-        </w:rPr>
-        <w:br/>
-      </w:r>
-      <w:r>
-        <w:rPr>
-          <w:rFonts w:ascii="Arial" w:hAnsi="Arial" w:cs="Arial"/>
-          <w:i/>
-          <w:sz w:val="20"/>
-          <w:szCs w:val="20"/>
-        </w:rPr>
-        <w:t>DR STONE | Casablanca, Morocco | July 2022 – January 2026</w:t>
-      </w:r>
-    </w:p>
-    <w:p>
-      <w:pPr>
-        <w:spacing w:after="60" w:line="360" w:lineRule="auto"/>
-        <w:rPr>
-          <w:rFonts w:ascii="Arial" w:hAnsi="Arial" w:cs="Arial"/>
-          <w:b/>
-        </w:rPr>
-      </w:pPr>
-      <w:r>
-        <w:rPr>
-          <w:rFonts w:ascii="Arial" w:hAnsi="Arial" w:cs="Arial"/>
-          <w:b/>
-        </w:rPr>
-        <w:t>Dr Turbine — AI-Powered Wind Turbine Inspection Platform</w:t>
-      </w:r>
-      <w:r>
-        <w:rPr>
-          <w:rFonts w:ascii="Arial" w:hAnsi="Arial" w:cs="Arial"/>
-          <w:b/>
-        </w:rPr>
-        <w:br/>
-      </w:r>
-      <w:r>
-        <w:rPr>
-          <w:rFonts w:ascii="Arial" w:hAnsi="Arial" w:cs="Arial"/>
-          <w:i/>
-          <w:sz w:val="20"/>
-          <w:szCs w:val="20"/>
-        </w:rPr>
-        <w:t>Stack: Next.js 15, React 19, TypeScript, Node.js, MySQL, Socket.IO, Prisma, shadcn/ui</w:t>
-      </w:r>
-    </w:p>
-    <w:p>
-      <w:pPr>
-        <w:pStyle w:val="ListBullet"/>
-        <w:spacing w:after="40" w:line="360" w:lineRule="auto"/>
-        <w:rPr>
-          <w:rFonts w:ascii="Arial" w:hAnsi="Arial" w:cs="Arial"/>
-          <w:sz w:val="20"/>
-          <w:szCs w:val="20"/>
-        </w:rPr>
-      </w:pPr>
-      <w:r>
-        <w:rPr>
-          <w:rFonts w:ascii="Arial" w:hAnsi="Arial" w:cs="Arial"/>
-          <w:sz w:val="20"/>
-          <w:szCs w:val="20"/>
-        </w:rPr>
-        <w:t>Architected frontend component library processing 10,000+ drone images monthly with 95% AI damage detection accuracy</w:t>
-      </w:r>
-    </w:p>
-    <w:p>
-      <w:pPr>
-        <w:pStyle w:val="ListBullet"/>
-        <w:spacing w:after="40" w:line="360" w:lineRule="auto"/>
-        <w:rPr>
-          <w:rFonts w:ascii="Arial" w:hAnsi="Arial" w:cs="Arial"/>
-          <w:sz w:val="20"/>
-          <w:szCs w:val="20"/>
-        </w:rPr>
-      </w:pPr>
-      <w:r>
-        <w:rPr>
-          <w:rFonts w:ascii="Arial" w:hAnsi="Arial" w:cs="Arial"/>
-          <w:sz w:val="20"/>
-          <w:szCs w:val="20"/>
-        </w:rPr>
-        <w:t>Built real-time collaborative annotation system with Socket.IO supporting 5+ simultaneous inspectors</w:t>
-      </w:r>
-    </w:p>
-    <w:p>
-      <w:pPr>
-        <w:pStyle w:val="ListBullet"/>
-        <w:spacing w:after="40" w:line="360" w:lineRule="auto"/>
-        <w:rPr>
-          <w:rFonts w:ascii="Arial" w:hAnsi="Arial" w:cs="Arial"/>
-          <w:sz w:val="20"/>
-          <w:szCs w:val="20"/>
-        </w:rPr>
-      </w:pPr>
-      <w:r>
-        <w:rPr>
-          <w:rFonts w:ascii="Arial" w:hAnsi="Arial" w:cs="Arial"/>
-          <w:sz w:val="20"/>
-          <w:szCs w:val="20"/>
-        </w:rPr>
-        <w:t>Optimized React rendering for large image datasets using lazy loading, virtualization, and Canvas-based overlays</w:t>
-      </w:r>
-    </w:p>
-    <w:p>
-      <w:pPr>
-        <w:pStyle w:val="ListBullet"/>
-        <w:spacing w:after="40" w:line="360" w:lineRule="auto"/>
-        <w:rPr>
-          <w:rFonts w:ascii="Arial" w:hAnsi="Arial" w:cs="Arial"/>
-          <w:sz w:val="20"/>
-          <w:szCs w:val="20"/>
-        </w:rPr>
-      </w:pPr>
-      <w:r>
-        <w:rPr>
-          <w:rFonts w:ascii="Arial" w:hAnsi="Arial" w:cs="Arial"/>
-          <w:sz w:val="20"/>
-          <w:szCs w:val="20"/>
-        </w:rPr>
-        <w:t>Reduced manual data entry by 80% through automated metadata extraction from drone imagery</w:t>
-      </w:r>
-    </w:p>
-    <w:p>
-      <w:pPr>
-        <w:pStyle w:val="ListBullet"/>
-        <w:numPr>
-          <w:ilvl w:val="0"/>
-          <w:numId w:val="0"/>
-        </w:numPr>
-        <w:spacing w:after="40" w:line="360" w:lineRule="auto"/>
-        <w:ind w:left="360"/>
-        <w:rPr>
-          <w:rFonts w:ascii="Arial" w:hAnsi="Arial" w:cs="Arial"/>
-          <w:sz w:val="20"/>
-          <w:szCs w:val="20"/>
-        </w:rPr>
-      </w:pPr>
-    </w:p>
-    <w:p>
-      <w:pPr>
-        <w:spacing w:after="60" w:line="360" w:lineRule="auto"/>
-        <w:rPr>
-          <w:rFonts w:ascii="Arial" w:hAnsi="Arial" w:cs="Arial"/>
-          <w:sz w:val="20"/>
-          <w:szCs w:val="20"/>
-        </w:rPr>
-      </w:pPr>
-      <w:r>
-        <w:rPr>
-          <w:rFonts w:ascii="Arial" w:hAnsi="Arial" w:cs="Arial"/>
-          <w:b/>
-        </w:rPr>
-        <w:t>FILAHI — Precision Agriculture SaaS Platform</w:t>
-      </w:r>
-      <w:r>
-        <w:rPr>
-          <w:rFonts w:ascii="Arial" w:hAnsi="Arial" w:cs="Arial"/>
-          <w:b/>
-        </w:rPr>
-        <w:br/>
-      </w:r>
-      <w:r>
-        <w:rPr>
-          <w:rFonts w:ascii="Arial" w:hAnsi="Arial" w:cs="Arial"/>
-          <w:i/>
-          <w:sz w:val="20"/>
-          <w:szCs w:val="20"/>
-        </w:rPr>
-        <w:t>Stack: Next.js, TypeScript, Node.js, MySQL, Prisma, NextAuth, Leaflet.js, shadcn/ui</w:t>
-      </w:r>
-    </w:p>
-    <w:p>
-      <w:pPr>
-        <w:pStyle w:val="ListBullet"/>
-        <w:spacing w:after="40" w:line="360" w:lineRule="auto"/>
-        <w:rPr>
-          <w:rFonts w:ascii="Arial" w:hAnsi="Arial" w:cs="Arial"/>
-          <w:sz w:val="20"/>
-          <w:szCs w:val="20"/>
-        </w:rPr>
-      </w:pPr>
-      <w:r>
-        <w:rPr>
-          <w:rFonts w:ascii="Arial" w:hAnsi="Arial" w:cs="Arial"/>
-          <w:sz w:val="20"/>
-          <w:szCs w:val="20"/>
-        </w:rPr>
-        <w:t xml:space="preserve">Deployed SaaS platform serving 500+ farmers managing 2,000+ agricultural plots with 92% AI crop detection </w:t>
-      </w:r>
-    </w:p>
-    <w:p>
-      <w:pPr>
-        <w:pStyle w:val="ListBullet"/>
-        <w:spacing w:after="40" w:line="360" w:lineRule="auto"/>
-        <w:rPr>
-          <w:rFonts w:ascii="Arial" w:hAnsi="Arial" w:cs="Arial"/>
-          <w:sz w:val="20"/>
-          <w:szCs w:val="20"/>
-        </w:rPr>
-      </w:pPr>
-      <w:r>
-        <w:rPr>
-          <w:rFonts w:ascii="Arial" w:hAnsi="Arial" w:cs="Arial"/>
-          <w:sz w:val="20"/>
-          <w:szCs w:val="20"/>
-        </w:rPr>
-        <w:t xml:space="preserve">Built interactive geospatial mapping with Leaflet.js and real-time satellite data visualization </w:t>
-      </w:r>
-    </w:p>
-    <w:p>
-      <w:pPr>
-        <w:pStyle w:val="ListBullet"/>
-        <w:spacing w:after="40" w:line="360" w:lineRule="auto"/>
-        <w:rPr>
-          <w:rFonts w:ascii="Arial" w:hAnsi="Arial" w:cs="Arial"/>
-          <w:sz w:val="20"/>
-          <w:szCs w:val="20"/>
-        </w:rPr>
-      </w:pPr>
-      <w:r>
-        <w:rPr>
-          <w:rFonts w:ascii="Arial" w:hAnsi="Arial" w:cs="Arial"/>
-          <w:sz w:val="20"/>
-          <w:szCs w:val="20"/>
-        </w:rPr>
-        <w:t>Optimized database queries and caching, improving response time by 45% and reducing report generation time by 70%</w:t>
-      </w:r>
-    </w:p>
-    <w:p>
-      <w:pPr>
-        <w:spacing w:after="120" w:line="360" w:lineRule="auto"/>
-        <w:rPr>
-          <w:rFonts w:ascii="Arial" w:hAnsi="Arial" w:cs="Arial"/>
-          <w:sz w:val="20"/>
-          <w:szCs w:val="20"/>
-        </w:rPr>
-      </w:pPr>
-      <w:r>
-        <w:rPr>
-          <w:rFonts w:ascii="Arial" w:hAnsi="Arial" w:cs="Arial"/>
-          <w:b/>
-          <w:sz w:val="20"/>
-          <w:szCs w:val="20"/>
-        </w:rPr>
-        <w:t>Additional Projects:</w:t>
-      </w:r>
-      <w:r>
-        <w:rPr>
-          <w:rFonts w:ascii="Arial" w:hAnsi="Arial" w:cs="Arial"/>
-          <w:b/>
-        </w:rPr>
-        <w:t xml:space="preserve"> </w:t>
-      </w:r>
-      <w:r>
-        <w:rPr>
-          <w:rFonts w:ascii="Arial" w:hAnsi="Arial" w:cs="Arial"/>
-          <w:sz w:val="20"/>
-          <w:szCs w:val="20"/>
-        </w:rPr>
-        <w:t xml:space="preserve">Developed multiple </w:t>
-      </w:r>
-      <w:r>
-        <w:rPr>
-          <w:rFonts w:ascii="Arial" w:hAnsi="Arial" w:cs="Arial"/>
-          <w:sz w:val="20"/>
-          <w:szCs w:val="20"/>
-        </w:rPr>
-        <w:t>webs</w:t>
-      </w:r>
-      <w:r>
-        <w:rPr>
-          <w:rFonts w:ascii="Arial" w:hAnsi="Arial" w:cs="Arial"/>
-          <w:sz w:val="20"/>
-          <w:szCs w:val="20"/>
-        </w:rPr>
-        <w:t>, mobile (React Native/Expo), and desktop (Electron) applications. Node.js API development, database design, and authentication implementation.</w:t>
-      </w:r>
-    </w:p>
-    <w:p>
-      <w:pPr>
-        <w:spacing w:after="60" w:line="360" w:lineRule="auto"/>
-        <w:rPr>
-          <w:rFonts w:ascii="Arial" w:hAnsi="Arial" w:cs="Arial"/>
-        </w:rPr>
-      </w:pPr>
-      <w:r>
-        <w:rPr>
-          <w:rFonts w:ascii="Arial" w:hAnsi="Arial" w:cs="Arial"/>
-          <w:b/>
-        </w:rPr>
-        <w:t>Freelance Web Developer</w:t>
-      </w:r>
-      <w:r>
-        <w:rPr>
-          <w:rFonts w:ascii="Arial" w:hAnsi="Arial" w:cs="Arial"/>
-          <w:b/>
-        </w:rPr>
-        <w:br/>
-      </w:r>
-      <w:r>
-        <w:rPr>
-          <w:rFonts w:ascii="Arial" w:hAnsi="Arial" w:cs="Arial"/>
-          <w:i/>
-          <w:sz w:val="20"/>
-          <w:szCs w:val="20"/>
-        </w:rPr>
-        <w:t>Self-Employed | Remote | 2020 – 2022</w:t>
-      </w:r>
-    </w:p>
-    <w:p>
-      <w:pPr>
-        <w:pStyle w:val="ListBullet"/>
-        <w:spacing w:after="40" w:line="360" w:lineRule="auto"/>
-        <w:rPr>
-          <w:rFonts w:ascii="Arial" w:hAnsi="Arial" w:cs="Arial"/>
-          <w:sz w:val="20"/>
-          <w:szCs w:val="20"/>
-        </w:rPr>
-      </w:pPr>
-      <w:r>
-        <w:rPr>
-          <w:rFonts w:ascii="Arial" w:hAnsi="Arial" w:cs="Arial"/>
-          <w:sz w:val="20"/>
-          <w:szCs w:val="20"/>
-        </w:rPr>
-        <w:t>Developed responsive web applications using React.js, Bootstrap v4/v5, JavaScript, HTML5, and CSS3/SCSS resulting in a 30% increase in mobile engagement for local clients.</w:t>
-      </w:r>
-    </w:p>
-    <w:p>
-      <w:pPr>
-        <w:pStyle w:val="ListBullet"/>
-        <w:spacing w:after="40" w:line="360" w:lineRule="auto"/>
-        <w:rPr>
-          <w:rFonts w:ascii="Arial" w:hAnsi="Arial" w:cs="Arial"/>
-          <w:sz w:val="20"/>
-          <w:szCs w:val="20"/>
-        </w:rPr>
-      </w:pPr>
-      <w:r>
-        <w:rPr>
-          <w:rFonts w:ascii="Arial" w:hAnsi="Arial" w:cs="Arial"/>
-          <w:sz w:val="20"/>
-          <w:szCs w:val="20"/>
-        </w:rPr>
-        <w:t>Built mobile-friendly interfaces with cross-browser compatibility</w:t>
-      </w:r>
-    </w:p>
-    <w:p>
-      <w:pPr>
-        <w:pStyle w:val="Heading1"/>
-        <w:spacing w:line="360" w:lineRule="auto"/>
-        <w:rPr>
-          <w:rFonts w:ascii="Arial" w:hAnsi="Arial" w:cs="Arial"/>
+          <w:rFonts w:asciiTheme="minorHAnsi" w:hAnsiTheme="minorHAnsi" w:cs="Arial"/>
           <w:color w:val="003366"/>
           <w:sz w:val="24"/>
         </w:rPr>
       </w:pPr>
       <w:r>
         <w:rPr>
-          <w:rFonts w:ascii="Arial" w:hAnsi="Arial" w:cs="Arial"/>
-          <w:color w:val="003366"/>
-          <w:sz w:val="24"/>
+          <w:rFonts w:asciiTheme="minorHAnsi" w:hAnsiTheme="minorHAnsi" w:cs="Arial" w:ascii="Arial" w:hAnsi="Arial" w:eastAsia="Arial"/>
+          <w:b/>
+          <w:color w:val="0D9488"/>
+          <w:sz w:val="18"/>
         </w:rPr>
         <w:t>EDUCATION &amp; PROFESSIONAL DEVELOPMENT</w:t>
       </w:r>
     </w:p>
     <w:p>
       <w:pPr>
-        <w:spacing w:line="360" w:lineRule="auto"/>
+        <w:spacing w:line="240" w:lineRule="auto" w:before="0" w:after="16"/>
         <w:rPr>
-          <w:rFonts w:ascii="Arial" w:hAnsi="Arial" w:cs="Arial"/>
+          <w:rFonts w:cs="Arial"/>
           <w:b/>
         </w:rPr>
       </w:pPr>
       <w:r>
         <w:rPr>
-          <w:rFonts w:ascii="Arial" w:hAnsi="Arial" w:cs="Arial"/>
-          <w:b/>
+          <w:rFonts w:cs="Arial" w:ascii="Arial" w:hAnsi="Arial" w:eastAsia="Arial"/>
+          <w:b w:val="0"/>
+          <w:color w:val="1E293B"/>
+          <w:sz w:val="16"/>
         </w:rPr>
-        <w:t>Bachelor's Degree in Life Sciences</w:t>
-      </w:r>
-      <w:r>
-        <w:rPr>
-          <w:rFonts w:ascii="Arial" w:hAnsi="Arial" w:cs="Arial"/>
-          <w:b/>
-        </w:rPr>
-        <w:t xml:space="preserve"> - </w:t>
-      </w:r>
-      <w:r>
-        <w:rPr>
-          <w:rFonts w:ascii="Arial" w:hAnsi="Arial" w:cs="Arial"/>
-          <w:b/>
-        </w:rPr>
-        <w:t>University</w:t>
-      </w:r>
-      <w:r>
-        <w:rPr>
-          <w:rFonts w:ascii="Arial" w:hAnsi="Arial" w:cs="Arial"/>
-          <w:b/>
-        </w:rPr>
-        <w:t xml:space="preserve"> </w:t>
-      </w:r>
-      <w:r>
-        <w:rPr>
-          <w:rFonts w:ascii="Arial" w:hAnsi="Arial" w:cs="Arial"/>
-          <w:b/>
-        </w:rPr>
-        <w:t xml:space="preserve">Sidi Mohamed Ben Abdellah </w:t>
-      </w:r>
-      <w:r>
-        <w:rPr>
-          <w:rFonts w:ascii="Arial" w:hAnsi="Arial" w:cs="Arial"/>
-          <w:b/>
-        </w:rPr>
-        <w:t>-</w:t>
-      </w:r>
-      <w:r>
-        <w:rPr>
-          <w:rFonts w:ascii="Arial" w:hAnsi="Arial" w:cs="Arial"/>
-          <w:b/>
-        </w:rPr>
-        <w:t xml:space="preserve"> Fez</w:t>
-      </w:r>
-      <w:r>
-        <w:rPr>
-          <w:rFonts w:ascii="Arial" w:hAnsi="Arial" w:cs="Arial"/>
-          <w:b/>
-        </w:rPr>
-        <w:t xml:space="preserve"> | 2014 - 2018</w:t>
+        <w:t>Bachelor's Degree in Life Sciences - University Sidi Mohamed Ben Abdellah - Fez | 2014 - 2018</w:t>
       </w:r>
     </w:p>
     <w:p>
       <w:pPr>
-        <w:spacing w:line="360" w:lineRule="auto"/>
+        <w:spacing w:line="240" w:lineRule="auto" w:before="0" w:after="16"/>
         <w:rPr>
-          <w:rFonts w:ascii="Arial" w:hAnsi="Arial" w:cs="Arial"/>
+          <w:rFonts w:cs="Arial"/>
           <w:b/>
-          <w:sz w:val="20"/>
-          <w:szCs w:val="20"/>
         </w:rPr>
       </w:pPr>
       <w:r>
         <w:rPr>
-          <w:rFonts w:ascii="Arial" w:hAnsi="Arial" w:cs="Arial"/>
-          <w:b/>
-          <w:sz w:val="20"/>
-          <w:szCs w:val="20"/>
+          <w:rFonts w:cs="Arial" w:ascii="Arial" w:hAnsi="Arial" w:eastAsia="Arial"/>
+          <w:b w:val="0"/>
+          <w:color w:val="1E293B"/>
+          <w:sz w:val="16"/>
         </w:rPr>
         <w:t>IT Diploma - Office Software, IT Maintenance &amp; Networks | 2019</w:t>
       </w:r>
     </w:p>
     <w:sectPr>
       <w:pgSz w:w="12240" w:h="15840"/>
-      <w:pgMar w:top="737" w:right="737" w:bottom="426" w:left="737" w:header="720" w:footer="720" w:gutter="0"/>
+      <w:pgMar w:top="605" w:right="792" w:bottom="605" w:left="792" w:header="720" w:footer="720" w:gutter="0"/>
       <w:cols w:space="720"/>
       <w:docGrid w:linePitch="360"/>
     </w:sectPr>
@@ -2471,6 +2437,10 @@
     <w:name w:val="Normal"/>
     <w:qFormat/>
     <w:rsid w:val="00635CFC"/>
+    <w:rPr>
+      <w:rFonts w:ascii="Arial" w:hAnsi="Arial" w:eastAsia="Arial"/>
+      <w:sz w:val="17"/>
+    </w:rPr>
   </w:style>
   <w:style w:type="paragraph" w:styleId="Heading1">
     <w:name w:val="heading 1"/>
@@ -2487,11 +2457,11 @@
       <w:outlineLvl w:val="0"/>
     </w:pPr>
     <w:rPr>
-      <w:rFonts w:asciiTheme="majorHAnsi" w:eastAsiaTheme="majorEastAsia" w:hAnsiTheme="majorHAnsi" w:cstheme="majorBidi"/>
+      <w:rFonts w:asciiTheme="majorHAnsi" w:eastAsiaTheme="majorEastAsia" w:hAnsiTheme="majorHAnsi" w:cstheme="majorBidi" w:ascii="Arial" w:hAnsi="Arial" w:eastAsia="Arial"/>
       <w:b/>
       <w:bCs/>
-      <w:color w:val="365F91" w:themeColor="accent1" w:themeShade="BF"/>
-      <w:sz w:val="28"/>
+      <w:color w:val="0D9488"/>
+      <w:sz w:val="18"/>
       <w:szCs w:val="28"/>
     </w:rPr>
   </w:style>
@@ -2684,6 +2654,7 @@
   <w:style w:type="character" w:default="1" w:styleId="DefaultParagraphFont">
     <w:name w:val="Default Paragraph Font"/>
     <w:uiPriority w:val="1"/>
+    <w:semiHidden/>
     <w:unhideWhenUsed/>
   </w:style>
   <w:style w:type="table" w:default="1" w:styleId="TableNormal">

</xml_diff>